<commit_message>
Final updates: V4 Pro Max, UI polish, sample essays, bug fixes
</commit_message>
<xml_diff>
--- a/案例信息表.docx
+++ b/案例信息表.docx
@@ -660,7 +660,7 @@
                 <w:b w:val="0"/>
                 <w:sz w:val="24"/>
               </w:rPr>
-              <w:t>https://github.com/xuzhichao/animal-writing-assistant（MIT开源协议）</w:t>
+              <w:t>https://github.com/707978439-cpu/animal-writing-assistant（MIT开源协议）</w:t>
             </w:r>
           </w:p>
         </w:tc>
@@ -803,7 +803,7 @@
                 <w:b w:val="0"/>
                 <w:sz w:val="24"/>
               </w:rPr>
-              <w:t>本案例聚焦四年级语文动物类习作教学中“个性化辅导不足”的核心痛点，借助国产DeepSeek大模型自主开发《动物习作AI智能助教》教育智能体。该工具包含四大功能模块：写作指导（输入动物名称即获针对性指导）、作文批改（从五个维度即时评分反馈）、互动问答（多轮对话解答写作疑问）、范文展示（预置优秀学生习作）。工具采用Flask本地Web架构，无需部署服务器，教师在自己的笔记本上即可运行。经惠州市富民小学四年级4个班级试用，学生习作字数平均提升32%，写作兴趣显著提高，教师批改效率提升约60%。</w:t>
+              <w:t>本案例聚焦四年级语文动物类习作教学中“个性化辅导不足”的核心痛点，借助国产DeepSeek大模型自主开发《动物习作AI智能助教》教育智能体。该工具包含写作闯关、好词好句墙、写作分析建议、互动问答、范文展示五大功能模块，采用Flask本地Web架构，无需部署服务器。经惠州市富民小学四年级4个班级试用，学生习作字数平均提升32%，写作兴趣显著提高，教师批改效率提升约60%。本工具采用MIT开源协议发布。</w:t>
             </w:r>
           </w:p>
         </w:tc>

</xml_diff>